<commit_message>
Kajian BNPB: GD Mitigasi final (31 foto) dan GD3 Rehabilitasi dan Rekonstruksi final
Mitigasi: perbaikan 16 gerbang QA, 31 foto Commons, 387 hlm, QA 37 lolos 0 gagal. GD3 Rehab-Rekon: naskah 12 bab, bagian depan, lampiran A-M, deck 18 slide, 246 hlm, QA 37 lolos 0 gagal. Mesin mengenal kode kajian rehab; gerbang yang diubah hanya positif palsu, masing-masing dengan fixture penolak.

Co-Authored-By: Claude Opus 5.5 <noreply@anthropic.com>
</commit_message>
<xml_diff>
--- a/data/kajian-bnpb/qa/fixtures/bersih-air.docx
+++ b/data/kajian-bnpb/qa/fixtures/bersih-air.docx
@@ -441,7 +441,7 @@
     </w:p>
     <w:p>
       <w:r>
-        <w:t xml:space="preserve">Rerata indeks risiko bencana Indonesia turun 17,8% dari 156,43 pada 2015 menjadi 128,52 pada 2024 (Badan Nasional Penanggulangan Bencana [BNPB], 2025b).</w:t>
+        <w:t xml:space="preserve">Rerata indeks risiko bencana Indonesia turun 17,8% dari 156,43 pada 2015 menjadi 128,52 pada 2024 (Badan Nasional Penanggulangan Bencana [BNPB], 2025d).</w:t>
       </w:r>
     </w:p>
     <w:p>
@@ -456,7 +456,7 @@
     </w:p>
     <w:p>
       <w:r>
-        <w:t xml:space="preserve">Rencana Nasional Penanggulangan Bencana (Renas PB) 2025–2029 menetapkan penurunan indeks risiko sebagai sasaran nasional (BNPB, 2025b).</w:t>
+        <w:t xml:space="preserve">Rencana Nasional Penanggulangan Bencana (Renas PB) 2025–2029 menetapkan penurunan indeks risiko sebagai sasaran nasional (BNPB, 2025d).</w:t>
       </w:r>
     </w:p>
     <w:tbl>
@@ -1761,7 +1761,7 @@
         <w:pStyle w:val="Pustaka"/>
       </w:pPr>
       <w:r>
-        <w:t xml:space="preserve">Badan Nasional Penanggulangan Bencana. (2025b). </w:t>
+        <w:t xml:space="preserve">Badan Nasional Penanggulangan Bencana. (2025d). </w:t>
       </w:r>
       <w:r>
         <w:t xml:space="preserve">Peraturan Badan Nasional Penanggulangan Bencana Nomor 1 Tahun 2025 tentang Rencana Nasional Penanggulangan Bencana Tahun 2025﻿–﻿2029</w:t>

</xml_diff>